<commit_message>
Ajustes na atuailizacao da nota
</commit_message>
<xml_diff>
--- a/docs/Documentacao_Projeto_Integracao_Notas_Fiscais.docx
+++ b/docs/Documentacao_Projeto_Integracao_Notas_Fiscais.docx
@@ -13,9 +13,9 @@
           <w:noProof/>
         </w:rPr>
         <w:drawing>
-          <wp:inline distT="0" distB="0" distL="0" distR="0" wp14:anchorId="58CD5770" wp14:editId="0941A567">
-            <wp:extent cx="1383093" cy="1388592"/>
-            <wp:effectExtent l="0" t="0" r="7620" b="2540"/>
+          <wp:inline distT="0" distB="0" distL="0" distR="0" wp14:anchorId="243A9441" wp14:editId="2FE18D16">
+            <wp:extent cx="1354631" cy="1360017"/>
+            <wp:effectExtent l="0" t="0" r="0" b="0"/>
             <wp:docPr id="1" name="Picture 1"/>
             <wp:cNvGraphicFramePr>
               <a:graphicFrameLocks xmlns:a="http://schemas.openxmlformats.org/drawingml/2006/main" noChangeAspect="1"/>
@@ -36,7 +36,7 @@
                   <pic:spPr>
                     <a:xfrm>
                       <a:off x="0" y="0"/>
-                      <a:ext cx="1389920" cy="1395446"/>
+                      <a:ext cx="1362400" cy="1367817"/>
                     </a:xfrm>
                     <a:prstGeom prst="rect">
                       <a:avLst/>
@@ -56,7 +56,7 @@
           <w:noProof/>
         </w:rPr>
         <w:drawing>
-          <wp:inline distT="0" distB="0" distL="0" distR="0" wp14:anchorId="58A055CD" wp14:editId="1A088BD1">
+          <wp:inline distT="0" distB="0" distL="0" distR="0" wp14:anchorId="76563FBA" wp14:editId="65D7B2A9">
             <wp:extent cx="1368000" cy="1368000"/>
             <wp:effectExtent l="0" t="0" r="0" b="0"/>
             <wp:docPr id="2" name="Picture 2"/>
@@ -162,7 +162,11 @@
         <w:jc w:val="center"/>
       </w:pPr>
       <w:r>
-        <w:t>Documento destinado ao cliente Versão 1.1 — Agosto/2026</w:t>
+        <w:t xml:space="preserve">Documento destinado ao cliente </w:t>
+      </w:r>
+      <w:r>
+        <w:br/>
+        <w:t>Versão 1.1 — Agosto/2026</w:t>
       </w:r>
       <w:r>
         <w:br/>
@@ -620,25 +624,7 @@
         <w:pStyle w:val="Commarcadores"/>
       </w:pPr>
       <w:r>
-        <w:t xml:space="preserve">Data de emissão a partir de </w:t>
-      </w:r>
-      <w:r>
-        <w:t>01</w:t>
-      </w:r>
-      <w:r>
-        <w:t>/0</w:t>
-      </w:r>
-      <w:r>
-        <w:t>7</w:t>
-      </w:r>
-      <w:r>
-        <w:t>/202</w:t>
-      </w:r>
-      <w:r>
-        <w:t>6</w:t>
-      </w:r>
-      <w:r>
-        <w:t>;</w:t>
+        <w:t>Data de emissão a partir de 14/05/2024;</w:t>
       </w:r>
     </w:p>
     <w:p>
@@ -738,13 +724,18 @@
     </w:p>
     <w:p>
       <w:r>
-        <w:t>No envio ao PR, a solução utiliza o total da nota, o desconto do cabeçalho e os valores dos itens conforme registrados no Tasy. O PR valida se o valor total da NF é coerente com a soma dos valores dos produtos.</w:t>
+        <w:t>O PR valida se a soma dos valores dos itens é igual ao valor total da nota (VALOR_TOTAL_NOTA), já considerando acréscimos ou descontos nesses valores. Ou seja: a conferência é soma(itens) = total da NF; o desconto não é aplicado pelo PR como um passo separado nessa validação.</w:t>
       </w:r>
     </w:p>
     <w:p>
       <w:r>
         <w:lastRenderedPageBreak/>
-        <w:t>Quando há desconto relevante no cabeçalho e os itens permanecem com valores brutos, o PR pode rejeitar a nota com mensagem do tipo “valor de entrada divergente (Estoque.NF &lt;&gt; Estoque.ProdutoNF)”. Nesse caso a divergência existe nos dados da nota no Tasy em relação à regra de fechamento do PR — não é um falso positivo do painel. A tratativa operacional é ajustar os valores no Tasy (ou alinhar a regra com o PR) e reemitir.</w:t>
+        <w:t>Por isso, na integração, o valor de cada item enviado ao PR é o valor líquido do item no Tasy (com fallback para o valor bruto se o líquido não estiver preenchido). O valor unitário é recalculado a partir desse líquido e da quantidade, para manter coerência. O total da nota continua sendo o VALOR_TOTAL_NOTA do Tasy. O campo de desconto do cabeçalho segue sendo informado no envio quando existir no Tasy.</w:t>
+      </w:r>
+    </w:p>
+    <w:p>
+      <w:r>
+        <w:t>Se, mesmo assim, o PR rejeitar com mensagem de valor divergente (Estoque.NF &lt;&gt; Estoque.ProdutoNF), convém conferir no Tasy se a soma dos líquidos dos itens elegíveis fecha com o total da nota.</w:t>
       </w:r>
     </w:p>
     <w:p>
@@ -1113,7 +1104,6 @@
         <w:pStyle w:val="Ttulo1"/>
       </w:pPr>
       <w:r>
-        <w:lastRenderedPageBreak/>
         <w:t>7. O painel web</w:t>
       </w:r>
     </w:p>
@@ -2215,31 +2205,31 @@
       </w:rPr>
     </w:lvl>
   </w:abstractNum>
-  <w:num w:numId="1" w16cid:durableId="1879656235">
+  <w:num w:numId="1" w16cid:durableId="1266616674">
     <w:abstractNumId w:val="8"/>
   </w:num>
-  <w:num w:numId="2" w16cid:durableId="627127652">
+  <w:num w:numId="2" w16cid:durableId="1109813434">
     <w:abstractNumId w:val="6"/>
   </w:num>
-  <w:num w:numId="3" w16cid:durableId="103036850">
+  <w:num w:numId="3" w16cid:durableId="1013804293">
     <w:abstractNumId w:val="5"/>
   </w:num>
-  <w:num w:numId="4" w16cid:durableId="106512691">
+  <w:num w:numId="4" w16cid:durableId="198010023">
     <w:abstractNumId w:val="4"/>
   </w:num>
-  <w:num w:numId="5" w16cid:durableId="2108303364">
+  <w:num w:numId="5" w16cid:durableId="445468955">
     <w:abstractNumId w:val="7"/>
   </w:num>
-  <w:num w:numId="6" w16cid:durableId="451218208">
+  <w:num w:numId="6" w16cid:durableId="2072578222">
     <w:abstractNumId w:val="3"/>
   </w:num>
-  <w:num w:numId="7" w16cid:durableId="1221670918">
+  <w:num w:numId="7" w16cid:durableId="2058164705">
     <w:abstractNumId w:val="2"/>
   </w:num>
-  <w:num w:numId="8" w16cid:durableId="1460804999">
+  <w:num w:numId="8" w16cid:durableId="924413445">
     <w:abstractNumId w:val="1"/>
   </w:num>
-  <w:num w:numId="9" w16cid:durableId="424805824">
+  <w:num w:numId="9" w16cid:durableId="643241898">
     <w:abstractNumId w:val="0"/>
   </w:num>
 </w:numbering>

</xml_diff>